<commit_message>
Adiciona mapa do draw.io na Aula 7: onde fica cada forma (nomes em inglês) e cola por atividade
</commit_message>
<xml_diff>
--- a/Aula 07 - 02-10-2026/Aula 7 - Apostila do Aluno.docx
+++ b/Aula 07 - 02-10-2026/Aula 7 - Apostila do Aluno.docx
@@ -723,7 +723,7 @@
       <w:r>
         <w:drawing>
           <wp:inline xmlns:a="http://schemas.openxmlformats.org/drawingml/2006/main" xmlns:pic="http://schemas.openxmlformats.org/drawingml/2006/picture">
-            <wp:extent cx="6332220" cy="2395975"/>
+            <wp:extent cx="6332220" cy="2221878"/>
             <wp:docPr id="1" name="Picture 1"/>
             <wp:cNvGraphicFramePr>
               <a:graphicFrameLocks noChangeAspect="1"/>
@@ -736,7 +736,13 @@
                     <pic:cNvPicPr/>
                   </pic:nvPicPr>
                   <pic:blipFill>
-                    <a:blip r:embed="rId9"/>
+                    <a:blip r:embed="rId9">
+                      <a:extLst>
+                        <a:ext uri="{96DAC541-7B7A-43D3-8B79-37D633B846F1}">
+                          <asvg:svgBlip xmlns:asvg="http://schemas.microsoft.com/office/drawing/2016/SVG/main" r:embed="rId16"/>
+                        </a:ext>
+                      </a:extLst>
+                    </a:blip>
                     <a:stretch>
                       <a:fillRect/>
                     </a:stretch>
@@ -744,7 +750,7 @@
                   <pic:spPr>
                     <a:xfrm>
                       <a:off x="0" y="0"/>
-                      <a:ext cx="6332220" cy="2395975"/>
+                      <a:ext cx="6332220" cy="2221878"/>
                     </a:xfrm>
                     <a:prstGeom prst="rect"/>
                   </pic:spPr>
@@ -1351,7 +1357,7 @@
       <w:r>
         <w:drawing>
           <wp:inline xmlns:a="http://schemas.openxmlformats.org/drawingml/2006/main" xmlns:pic="http://schemas.openxmlformats.org/drawingml/2006/picture">
-            <wp:extent cx="4432554" cy="3166110"/>
+            <wp:extent cx="4432554" cy="2900447"/>
             <wp:docPr id="2" name="Picture 2"/>
             <wp:cNvGraphicFramePr>
               <a:graphicFrameLocks noChangeAspect="1"/>
@@ -1364,7 +1370,13 @@
                     <pic:cNvPicPr/>
                   </pic:nvPicPr>
                   <pic:blipFill>
-                    <a:blip r:embed="rId10"/>
+                    <a:blip r:embed="rId10">
+                      <a:extLst>
+                        <a:ext uri="{96DAC541-7B7A-43D3-8B79-37D633B846F1}">
+                          <asvg:svgBlip xmlns:asvg="http://schemas.microsoft.com/office/drawing/2016/SVG/main" r:embed="rId17"/>
+                        </a:ext>
+                      </a:extLst>
+                    </a:blip>
                     <a:stretch>
                       <a:fillRect/>
                     </a:stretch>
@@ -1372,7 +1384,7 @@
                   <pic:spPr>
                     <a:xfrm>
                       <a:off x="0" y="0"/>
-                      <a:ext cx="4432554" cy="3166110"/>
+                      <a:ext cx="4432554" cy="2900447"/>
                     </a:xfrm>
                     <a:prstGeom prst="rect"/>
                   </pic:spPr>
@@ -1467,7 +1479,7 @@
       <w:r>
         <w:drawing>
           <wp:inline xmlns:a="http://schemas.openxmlformats.org/drawingml/2006/main" xmlns:pic="http://schemas.openxmlformats.org/drawingml/2006/picture">
-            <wp:extent cx="5065776" cy="4330421"/>
+            <wp:extent cx="5033997" cy="4330421"/>
             <wp:docPr id="3" name="Picture 3"/>
             <wp:cNvGraphicFramePr>
               <a:graphicFrameLocks noChangeAspect="1"/>
@@ -1480,7 +1492,13 @@
                     <pic:cNvPicPr/>
                   </pic:nvPicPr>
                   <pic:blipFill>
-                    <a:blip r:embed="rId11"/>
+                    <a:blip r:embed="rId11">
+                      <a:extLst>
+                        <a:ext uri="{96DAC541-7B7A-43D3-8B79-37D633B846F1}">
+                          <asvg:svgBlip xmlns:asvg="http://schemas.microsoft.com/office/drawing/2016/SVG/main" r:embed="rId18"/>
+                        </a:ext>
+                      </a:extLst>
+                    </a:blip>
                     <a:stretch>
                       <a:fillRect/>
                     </a:stretch>
@@ -1488,7 +1506,7 @@
                   <pic:spPr>
                     <a:xfrm>
                       <a:off x="0" y="0"/>
-                      <a:ext cx="5065776" cy="4330421"/>
+                      <a:ext cx="5033997" cy="4330421"/>
                     </a:xfrm>
                     <a:prstGeom prst="rect"/>
                   </pic:spPr>
@@ -1527,7 +1545,7 @@
       <w:r>
         <w:drawing>
           <wp:inline xmlns:a="http://schemas.openxmlformats.org/drawingml/2006/main" xmlns:pic="http://schemas.openxmlformats.org/drawingml/2006/picture">
-            <wp:extent cx="5698998" cy="3343412"/>
+            <wp:extent cx="5698998" cy="3316485"/>
             <wp:docPr id="4" name="Picture 4"/>
             <wp:cNvGraphicFramePr>
               <a:graphicFrameLocks noChangeAspect="1"/>
@@ -1540,7 +1558,13 @@
                     <pic:cNvPicPr/>
                   </pic:nvPicPr>
                   <pic:blipFill>
-                    <a:blip r:embed="rId12"/>
+                    <a:blip r:embed="rId12">
+                      <a:extLst>
+                        <a:ext uri="{96DAC541-7B7A-43D3-8B79-37D633B846F1}">
+                          <asvg:svgBlip xmlns:asvg="http://schemas.microsoft.com/office/drawing/2016/SVG/main" r:embed="rId19"/>
+                        </a:ext>
+                      </a:extLst>
+                    </a:blip>
                     <a:stretch>
                       <a:fillRect/>
                     </a:stretch>
@@ -1548,7 +1572,7 @@
                   <pic:spPr>
                     <a:xfrm>
                       <a:off x="0" y="0"/>
-                      <a:ext cx="5698998" cy="3343412"/>
+                      <a:ext cx="5698998" cy="3316485"/>
                     </a:xfrm>
                     <a:prstGeom prst="rect"/>
                   </pic:spPr>
@@ -2158,7 +2182,7 @@
     </w:p>
     <w:p>
       <w:r>
-        <w:t>As ações do diagrama de atividades costumam corresponder a MÉTODOS das classes, e as decisões consultam ATRIBUTOS. “Aplica 5% de desconto” corresponde a Pedido.aplicarDesconto(); “Credita os pontos” corresponde a Cliente.acumularPontos(); a decisão [valor total ≥ R$ 15,00] usa o atributo derivado Pedido./valorTotal. Se uma ação não tem nenhuma classe “dona” dela, talvez esteja faltando algo no diagrama de classes. Os diagramas conversam entre si: é o mesmo sistema visto de ângulos diferentes.</w:t>
+        <w:t>As ações do diagrama de atividades costumam corresponder a MÉTODOS das classes, e as decisões consultam ATRIBUTOS. “Aplica 5% de desconto” corresponde a Pagamento.aplicarDesconto(); “Credita os pontos” corresponde a Cliente.acumularPontos(); a decisão [valor total ≥ R$ 15,00] usa o atributo derivado Pedido./valorTotal. Se uma ação não tem nenhuma classe “dona” dela, talvez esteja faltando algo no diagrama de classes. Os diagramas conversam entre si: é o mesmo sistema visto de ângulos diferentes.</w:t>
       </w:r>
     </w:p>
     <w:p>
@@ -2237,7 +2261,7 @@
       <w:r>
         <w:drawing>
           <wp:inline xmlns:a="http://schemas.openxmlformats.org/drawingml/2006/main" xmlns:pic="http://schemas.openxmlformats.org/drawingml/2006/picture">
-            <wp:extent cx="5698998" cy="5319065"/>
+            <wp:extent cx="5655035" cy="5319065"/>
             <wp:docPr id="5" name="Picture 5"/>
             <wp:cNvGraphicFramePr>
               <a:graphicFrameLocks noChangeAspect="1"/>
@@ -2250,7 +2274,13 @@
                     <pic:cNvPicPr/>
                   </pic:nvPicPr>
                   <pic:blipFill>
-                    <a:blip r:embed="rId13"/>
+                    <a:blip r:embed="rId13">
+                      <a:extLst>
+                        <a:ext uri="{96DAC541-7B7A-43D3-8B79-37D633B846F1}">
+                          <asvg:svgBlip xmlns:asvg="http://schemas.microsoft.com/office/drawing/2016/SVG/main" r:embed="rId20"/>
+                        </a:ext>
+                      </a:extLst>
+                    </a:blip>
                     <a:stretch>
                       <a:fillRect/>
                     </a:stretch>
@@ -2258,7 +2288,7 @@
                   <pic:spPr>
                     <a:xfrm>
                       <a:off x="0" y="0"/>
-                      <a:ext cx="5698998" cy="5319065"/>
+                      <a:ext cx="5655035" cy="5319065"/>
                     </a:xfrm>
                     <a:prstGeom prst="rect"/>
                   </pic:spPr>
@@ -2309,13 +2339,743 @@
       </w:r>
     </w:p>
     <w:p>
+      <w:pPr>
+        <w:pStyle w:val="Heading2"/>
+      </w:pPr>
       <w:r>
-        <w:t>1.  Abram o draw.io e procurem, na barra de formas, a biblioteca “UML”.</w:t>
+        <w:t>6.1 Onde fica cada coisa no draw.io</w:t>
+      </w:r>
+    </w:p>
+    <w:p>
+      <w:pPr/>
+      <w:r>
+        <w:t>Antes de desenhar, vale conhecer a tela. Tudo o que você vai usar hoje fica em seis lugares (os números da figura abaixo):</w:t>
+      </w:r>
+    </w:p>
+    <w:p>
+      <w:pPr>
+        <w:jc w:val="center"/>
+      </w:pPr>
+      <w:pPr/>
+      <w:r>
+        <w:drawing>
+          <wp:inline xmlns:a="http://schemas.openxmlformats.org/drawingml/2006/main" xmlns:pic="http://schemas.openxmlformats.org/drawingml/2006/picture">
+            <wp:extent cx="5760720" cy="3538728"/>
+            <wp:docPr id="8" name="Picture 8"/>
+            <wp:cNvGraphicFramePr>
+              <a:graphicFrameLocks noChangeAspect="1"/>
+            </wp:cNvGraphicFramePr>
+            <a:graphic>
+              <a:graphicData uri="http://schemas.openxmlformats.org/drawingml/2006/picture">
+                <pic:pic>
+                  <pic:nvPicPr>
+                    <pic:cNvPr id="0" name="drawio_tela_geral.png"/>
+                    <pic:cNvPicPr/>
+                  </pic:nvPicPr>
+                  <pic:blipFill>
+                    <a:blip r:embed="rId23"/>
+                    <a:stretch>
+                      <a:fillRect/>
+                    </a:stretch>
+                  </pic:blipFill>
+                  <pic:spPr>
+                    <a:xfrm>
+                      <a:off x="0" y="0"/>
+                      <a:ext cx="5760720" cy="3538728"/>
+                    </a:xfrm>
+                    <a:prstGeom prst="rect"/>
+                  </pic:spPr>
+                </pic:pic>
+              </a:graphicData>
+            </a:graphic>
+          </wp:inline>
+        </w:drawing>
+      </w:r>
+    </w:p>
+    <w:p>
+      <w:pPr>
+        <w:pStyle w:val="Caption"/>
+      </w:pPr>
+      <w:r>
+        <w:t>Figura 6 — A tela do draw.io e seus seis lugares principais.</w:t>
+      </w:r>
+    </w:p>
+    <w:p>
+      <w:pPr/>
+      <w:r>
+        <w:t>1.  Pesquisa de formas: digite o nome da forma (em inglês) e aperte Enter. Ex.: “flow final”.</w:t>
+      </w:r>
+    </w:p>
+    <w:p>
+      <w:pPr/>
+      <w:r>
+        <w:t>2.  Paleta UML: clique no nome “UML” para abrir a lista. Dela saem quase todas as formas do diagrama de atividades.</w:t>
+      </w:r>
+    </w:p>
+    <w:p>
+      <w:pPr/>
+      <w:r>
+        <w:t>3.  Menu Arquivo: “Salvar como” guarda o arquivo .drawio (que você pode editar depois); “Exportar como › PNG” gera uma imagem para entregar.</w:t>
+      </w:r>
+    </w:p>
+    <w:p>
+      <w:pPr/>
+      <w:r>
+        <w:t>4.  Área de desenho: arraste as formas da esquerda e solte aqui.</w:t>
+      </w:r>
+    </w:p>
+    <w:p>
+      <w:pPr/>
+      <w:r>
+        <w:t>5.  Painel da direita: com uma forma selecionada, mostra as abas Estilo, Texto e Organizar (cor, fonte, tamanho).</w:t>
+      </w:r>
+    </w:p>
+    <w:p>
+      <w:pPr/>
+      <w:r>
+        <w:t>6.  Páginas: as abas da parte de baixo. O botão “+” cria outra página no mesmo arquivo — útil para separar partes de um trabalho.</w:t>
+      </w:r>
+    </w:p>
+    <w:p>
+      <w:pPr/>
+      <w:r>
+        <w:t>Na paleta UML, as formas do diagrama de atividades ficam no fim da lista. Ao parar o mouse sobre um ícone, o draw.io mostra o nome dele em inglês — é por esse nome que a tabela abaixo se orienta.</w:t>
+      </w:r>
+    </w:p>
+    <w:p>
+      <w:pPr>
+        <w:jc w:val="center"/>
+      </w:pPr>
+      <w:pPr/>
+      <w:r>
+        <w:drawing>
+          <wp:inline xmlns:a="http://schemas.openxmlformats.org/drawingml/2006/main" xmlns:pic="http://schemas.openxmlformats.org/drawingml/2006/picture">
+            <wp:extent cx="4754880" cy="3389709"/>
+            <wp:docPr id="9" name="Picture 9"/>
+            <wp:cNvGraphicFramePr>
+              <a:graphicFrameLocks noChangeAspect="1"/>
+            </wp:cNvGraphicFramePr>
+            <a:graphic>
+              <a:graphicData uri="http://schemas.openxmlformats.org/drawingml/2006/picture">
+                <pic:pic>
+                  <pic:nvPicPr>
+                    <pic:cNvPr id="0" name="drawio_paleta_uml.png"/>
+                    <pic:cNvPicPr/>
+                  </pic:nvPicPr>
+                  <pic:blipFill>
+                    <a:blip r:embed="rId24"/>
+                    <a:stretch>
+                      <a:fillRect/>
+                    </a:stretch>
+                  </pic:blipFill>
+                  <pic:spPr>
+                    <a:xfrm>
+                      <a:off x="0" y="0"/>
+                      <a:ext cx="4754880" cy="3389709"/>
+                    </a:xfrm>
+                    <a:prstGeom prst="rect"/>
+                  </pic:spPr>
+                </pic:pic>
+              </a:graphicData>
+            </a:graphic>
+          </wp:inline>
+        </w:drawing>
+      </w:r>
+    </w:p>
+    <w:p>
+      <w:pPr>
+        <w:pStyle w:val="Caption"/>
+      </w:pPr>
+      <w:r>
+        <w:t>Figura 7 — As formas do diagrama de atividades na paleta UML.</w:t>
+      </w:r>
+    </w:p>
+    <w:p>
+      <w:pPr/>
+      <w:r>
+        <w:t>Duas formas não estão na paleta UML: a raia, que fica na paleta Geral, e o nó final de fluxo, que se encontra pela pesquisa.</w:t>
+      </w:r>
+    </w:p>
+    <w:p>
+      <w:pPr>
+        <w:jc w:val="center"/>
+      </w:pPr>
+      <w:pPr/>
+      <w:r>
+        <w:drawing>
+          <wp:inline xmlns:a="http://schemas.openxmlformats.org/drawingml/2006/main" xmlns:pic="http://schemas.openxmlformats.org/drawingml/2006/picture">
+            <wp:extent cx="5760720" cy="1695841"/>
+            <wp:docPr id="10" name="Picture 10"/>
+            <wp:cNvGraphicFramePr>
+              <a:graphicFrameLocks noChangeAspect="1"/>
+            </wp:cNvGraphicFramePr>
+            <a:graphic>
+              <a:graphicData uri="http://schemas.openxmlformats.org/drawingml/2006/picture">
+                <pic:pic>
+                  <pic:nvPicPr>
+                    <pic:cNvPr id="0" name="drawio_raia_e_final.png"/>
+                    <pic:cNvPicPr/>
+                  </pic:nvPicPr>
+                  <pic:blipFill>
+                    <a:blip r:embed="rId25"/>
+                    <a:stretch>
+                      <a:fillRect/>
+                    </a:stretch>
+                  </pic:blipFill>
+                  <pic:spPr>
+                    <a:xfrm>
+                      <a:off x="0" y="0"/>
+                      <a:ext cx="5760720" cy="1695841"/>
+                    </a:xfrm>
+                    <a:prstGeom prst="rect"/>
+                  </pic:spPr>
+                </pic:pic>
+              </a:graphicData>
+            </a:graphic>
+          </wp:inline>
+        </w:drawing>
+      </w:r>
+    </w:p>
+    <w:p>
+      <w:pPr>
+        <w:pStyle w:val="Caption"/>
+      </w:pPr>
+      <w:r>
+        <w:t>Figura 8 — A raia (paleta Geral) e o nó final de fluxo (pela pesquisa “flow final”).</w:t>
+      </w:r>
+    </w:p>
+    <w:p>
+      <w:pPr/>
+      <w:r>
+        <w:t>Tabela-resumo — onde fica cada elemento:</w:t>
+      </w:r>
+    </w:p>
+    <w:tbl>
+      <w:tblPr>
+        <w:tblStyle w:val="TableGrid"/>
+        <w:tblW w:type="auto" w:w="0"/>
+        <w:tblLook w:firstColumn="1" w:firstRow="1" w:lastColumn="0" w:lastRow="0" w:noHBand="0" w:noVBand="1" w:val="04A0"/>
+      </w:tblPr>
+      <w:tblGrid>
+        <w:gridCol w:w="3324"/>
+        <w:gridCol w:w="3324"/>
+        <w:gridCol w:w="3324"/>
+      </w:tblGrid>
+      <w:tr>
+        <w:tc>
+          <w:tcPr>
+            <w:tcW w:type="dxa" w:w="2227"/>
+            <w:shd w:val="clear" w:color="auto" w:fill="1F497D"/>
+          </w:tcPr>
+          <w:p>
+            <w:pPr>
+              <w:spacing w:after="40"/>
+            </w:pPr>
+            <w:r>
+              <w:rPr>
+                <w:b/>
+                <w:color w:val="FFFFFF"/>
+                <w:sz w:val="20"/>
+              </w:rPr>
+              <w:t>Elemento</w:t>
+            </w:r>
+          </w:p>
+        </w:tc>
+        <w:tc>
+          <w:tcPr>
+            <w:tcW w:type="dxa" w:w="2904"/>
+            <w:shd w:val="clear" w:color="auto" w:fill="1F497D"/>
+          </w:tcPr>
+          <w:p>
+            <w:pPr>
+              <w:spacing w:after="40"/>
+            </w:pPr>
+            <w:r>
+              <w:rPr>
+                <w:b/>
+                <w:color w:val="FFFFFF"/>
+                <w:sz w:val="20"/>
+              </w:rPr>
+              <w:t>Onde fica no draw.io</w:t>
+            </w:r>
+          </w:p>
+        </w:tc>
+        <w:tc>
+          <w:tcPr>
+            <w:tcW w:type="dxa" w:w="4841"/>
+            <w:shd w:val="clear" w:color="auto" w:fill="1F497D"/>
+          </w:tcPr>
+          <w:p>
+            <w:pPr>
+              <w:spacing w:after="40"/>
+            </w:pPr>
+            <w:r>
+              <w:rPr>
+                <w:b/>
+                <w:color w:val="FFFFFF"/>
+                <w:sz w:val="20"/>
+              </w:rPr>
+              <w:t>Dica</w:t>
+            </w:r>
+          </w:p>
+        </w:tc>
+      </w:tr>
+      <w:tr>
+        <w:tc>
+          <w:tcPr>
+            <w:tcW w:type="dxa" w:w="2227"/>
+          </w:tcPr>
+          <w:p>
+            <w:r>
+              <w:rPr>
+                <w:sz w:val="20"/>
+              </w:rPr>
+              <w:t>Nó inicial</w:t>
+            </w:r>
+          </w:p>
+        </w:tc>
+        <w:tc>
+          <w:tcPr>
+            <w:tcW w:type="dxa" w:w="2904"/>
+          </w:tcPr>
+          <w:p>
+            <w:r>
+              <w:rPr>
+                <w:sz w:val="20"/>
+              </w:rPr>
+              <w:t>Paleta UML › “Start”</w:t>
+            </w:r>
+          </w:p>
+        </w:tc>
+        <w:tc>
+          <w:tcPr>
+            <w:tcW w:type="dxa" w:w="4841"/>
+          </w:tcPr>
+          <w:p>
+            <w:r>
+              <w:rPr>
+                <w:sz w:val="20"/>
+              </w:rPr>
+              <w:t>Bolinha preta; já vem com uma seta pendurada — ligue a ponta dela na primeira ação.</w:t>
+            </w:r>
+          </w:p>
+        </w:tc>
+      </w:tr>
+      <w:tr>
+        <w:tc>
+          <w:tcPr>
+            <w:tcW w:type="dxa" w:w="2227"/>
+          </w:tcPr>
+          <w:p>
+            <w:r>
+              <w:rPr>
+                <w:sz w:val="20"/>
+              </w:rPr>
+              <w:t>Ação</w:t>
+            </w:r>
+          </w:p>
+        </w:tc>
+        <w:tc>
+          <w:tcPr>
+            <w:tcW w:type="dxa" w:w="2904"/>
+          </w:tcPr>
+          <w:p>
+            <w:r>
+              <w:rPr>
+                <w:sz w:val="20"/>
+              </w:rPr>
+              <w:t>Paleta UML › “Activity”</w:t>
+            </w:r>
+          </w:p>
+        </w:tc>
+        <w:tc>
+          <w:tcPr>
+            <w:tcW w:type="dxa" w:w="4841"/>
+          </w:tcPr>
+          <w:p>
+            <w:r>
+              <w:rPr>
+                <w:sz w:val="20"/>
+              </w:rPr>
+              <w:t>Duplo clique para escrever (verbo + complemento).</w:t>
+            </w:r>
+          </w:p>
+        </w:tc>
+      </w:tr>
+      <w:tr>
+        <w:tc>
+          <w:tcPr>
+            <w:tcW w:type="dxa" w:w="2227"/>
+          </w:tcPr>
+          <w:p>
+            <w:r>
+              <w:rPr>
+                <w:sz w:val="20"/>
+              </w:rPr>
+              <w:t>Decisão e junção</w:t>
+            </w:r>
+          </w:p>
+        </w:tc>
+        <w:tc>
+          <w:tcPr>
+            <w:tcW w:type="dxa" w:w="2904"/>
+          </w:tcPr>
+          <w:p>
+            <w:r>
+              <w:rPr>
+                <w:sz w:val="20"/>
+              </w:rPr>
+              <w:t>Paleta UML › “Condition”</w:t>
+            </w:r>
+          </w:p>
+        </w:tc>
+        <w:tc>
+          <w:tcPr>
+            <w:tcW w:type="dxa" w:w="4841"/>
+          </w:tcPr>
+          <w:p>
+            <w:r>
+              <w:rPr>
+                <w:sz w:val="20"/>
+              </w:rPr>
+              <w:t>É o mesmo losango: com 1 entrada e várias saídas é decisão; com várias entradas e 1 saída é junção.</w:t>
+            </w:r>
+          </w:p>
+        </w:tc>
+      </w:tr>
+      <w:tr>
+        <w:tc>
+          <w:tcPr>
+            <w:tcW w:type="dxa" w:w="2227"/>
+          </w:tcPr>
+          <w:p>
+            <w:r>
+              <w:rPr>
+                <w:sz w:val="20"/>
+              </w:rPr>
+              <w:t>Bifurcação e união</w:t>
+            </w:r>
+          </w:p>
+        </w:tc>
+        <w:tc>
+          <w:tcPr>
+            <w:tcW w:type="dxa" w:w="2904"/>
+          </w:tcPr>
+          <w:p>
+            <w:r>
+              <w:rPr>
+                <w:sz w:val="20"/>
+              </w:rPr>
+              <w:t>Paleta UML › “Fork/Join”</w:t>
+            </w:r>
+          </w:p>
+        </w:tc>
+        <w:tc>
+          <w:tcPr>
+            <w:tcW w:type="dxa" w:w="4841"/>
+          </w:tcPr>
+          <w:p>
+            <w:r>
+              <w:rPr>
+                <w:sz w:val="20"/>
+              </w:rPr>
+              <w:t>Barra preta; estique pelas alças para cobrir todas as setas. Uma barra abre, outra fecha.</w:t>
+            </w:r>
+          </w:p>
+        </w:tc>
+      </w:tr>
+      <w:tr>
+        <w:tc>
+          <w:tcPr>
+            <w:tcW w:type="dxa" w:w="2227"/>
+          </w:tcPr>
+          <w:p>
+            <w:r>
+              <w:rPr>
+                <w:sz w:val="20"/>
+              </w:rPr>
+              <w:t>Nó final da atividade</w:t>
+            </w:r>
+          </w:p>
+        </w:tc>
+        <w:tc>
+          <w:tcPr>
+            <w:tcW w:type="dxa" w:w="2904"/>
+          </w:tcPr>
+          <w:p>
+            <w:r>
+              <w:rPr>
+                <w:sz w:val="20"/>
+              </w:rPr>
+              <w:t>Paleta UML › “End”</w:t>
+            </w:r>
+          </w:p>
+        </w:tc>
+        <w:tc>
+          <w:tcPr>
+            <w:tcW w:type="dxa" w:w="4841"/>
+          </w:tcPr>
+          <w:p>
+            <w:r>
+              <w:rPr>
+                <w:sz w:val="20"/>
+              </w:rPr>
+              <w:t>O “alvo”. Pode haver mais de um no diagrama.</w:t>
+            </w:r>
+          </w:p>
+        </w:tc>
+      </w:tr>
+      <w:tr>
+        <w:tc>
+          <w:tcPr>
+            <w:tcW w:type="dxa" w:w="2227"/>
+          </w:tcPr>
+          <w:p>
+            <w:r>
+              <w:rPr>
+                <w:sz w:val="20"/>
+              </w:rPr>
+              <w:t>Nó final de fluxo</w:t>
+            </w:r>
+          </w:p>
+        </w:tc>
+        <w:tc>
+          <w:tcPr>
+            <w:tcW w:type="dxa" w:w="2904"/>
+          </w:tcPr>
+          <w:p>
+            <w:r>
+              <w:rPr>
+                <w:sz w:val="20"/>
+              </w:rPr>
+              <w:t>Pesquisa: “flow final”</w:t>
+            </w:r>
+          </w:p>
+        </w:tc>
+        <w:tc>
+          <w:tcPr>
+            <w:tcW w:type="dxa" w:w="4841"/>
+          </w:tcPr>
+          <w:p>
+            <w:r>
+              <w:rPr>
+                <w:sz w:val="20"/>
+              </w:rPr>
+              <w:t>Círculo com X; arraste qualquer um dos dois que aparecem.</w:t>
+            </w:r>
+          </w:p>
+        </w:tc>
+      </w:tr>
+      <w:tr>
+        <w:tc>
+          <w:tcPr>
+            <w:tcW w:type="dxa" w:w="2227"/>
+          </w:tcPr>
+          <w:p>
+            <w:r>
+              <w:rPr>
+                <w:sz w:val="20"/>
+              </w:rPr>
+              <w:t>Raia</w:t>
+            </w:r>
+          </w:p>
+        </w:tc>
+        <w:tc>
+          <w:tcPr>
+            <w:tcW w:type="dxa" w:w="2904"/>
+          </w:tcPr>
+          <w:p>
+            <w:r>
+              <w:rPr>
+                <w:sz w:val="20"/>
+              </w:rPr>
+              <w:t>Paleta Geral › “Vertical Container”</w:t>
+            </w:r>
+          </w:p>
+        </w:tc>
+        <w:tc>
+          <w:tcPr>
+            <w:tcW w:type="dxa" w:w="4841"/>
+          </w:tcPr>
+          <w:p>
+            <w:r>
+              <w:rPr>
+                <w:sz w:val="20"/>
+              </w:rPr>
+              <w:t>Uma por responsável, lado a lado; escreva o nome no cabeçalho.</w:t>
+            </w:r>
+          </w:p>
+        </w:tc>
+      </w:tr>
+      <w:tr>
+        <w:tc>
+          <w:tcPr>
+            <w:tcW w:type="dxa" w:w="2227"/>
+          </w:tcPr>
+          <w:p>
+            <w:r>
+              <w:rPr>
+                <w:sz w:val="20"/>
+              </w:rPr>
+              <w:t>Guarda</w:t>
+            </w:r>
+          </w:p>
+        </w:tc>
+        <w:tc>
+          <w:tcPr>
+            <w:tcW w:type="dxa" w:w="2904"/>
+          </w:tcPr>
+          <w:p>
+            <w:r>
+              <w:rPr>
+                <w:sz w:val="20"/>
+              </w:rPr>
+              <w:t>Na própria seta</w:t>
+            </w:r>
+          </w:p>
+        </w:tc>
+        <w:tc>
+          <w:tcPr>
+            <w:tcW w:type="dxa" w:w="4841"/>
+          </w:tcPr>
+          <w:p>
+            <w:r>
+              <w:rPr>
+                <w:sz w:val="20"/>
+              </w:rPr>
+              <w:t>Duplo clique na seta que sai da decisão e digite [sim], [não]...</w:t>
+            </w:r>
+          </w:p>
+        </w:tc>
+      </w:tr>
+    </w:tbl>
+    <w:p>
+      <w:pPr/>
+    </w:p>
+    <w:p>
+      <w:pPr/>
+      <w:r>
+        <w:t>Para ligar uma forma à outra, pare o mouse sobre a forma: aparecem quatro setas azuis (1 na figura). Arraste uma delas até a próxima forma e solte quando ela ficar destacada — a seta fica presa às duas formas e as acompanha quando você as move. Os pequenos “x” azuis em volta da forma (2) são os pontos de conexão. A guarda é escrita com duplo clique na própria seta (3).</w:t>
+      </w:r>
+    </w:p>
+    <w:p>
+      <w:pPr>
+        <w:jc w:val="center"/>
+      </w:pPr>
+      <w:pPr/>
+      <w:r>
+        <w:drawing>
+          <wp:inline xmlns:a="http://schemas.openxmlformats.org/drawingml/2006/main" xmlns:pic="http://schemas.openxmlformats.org/drawingml/2006/picture">
+            <wp:extent cx="4389120" cy="2785403"/>
+            <wp:docPr id="11" name="Picture 11"/>
+            <wp:cNvGraphicFramePr>
+              <a:graphicFrameLocks noChangeAspect="1"/>
+            </wp:cNvGraphicFramePr>
+            <a:graphic>
+              <a:graphicData uri="http://schemas.openxmlformats.org/drawingml/2006/picture">
+                <pic:pic>
+                  <pic:nvPicPr>
+                    <pic:cNvPr id="0" name="drawio_conectar.png"/>
+                    <pic:cNvPicPr/>
+                  </pic:nvPicPr>
+                  <pic:blipFill>
+                    <a:blip r:embed="rId26"/>
+                    <a:stretch>
+                      <a:fillRect/>
+                    </a:stretch>
+                  </pic:blipFill>
+                  <pic:spPr>
+                    <a:xfrm>
+                      <a:off x="0" y="0"/>
+                      <a:ext cx="4389120" cy="2785403"/>
+                    </a:xfrm>
+                    <a:prstGeom prst="rect"/>
+                  </pic:spPr>
+                </pic:pic>
+              </a:graphicData>
+            </a:graphic>
+          </wp:inline>
+        </w:drawing>
+      </w:r>
+    </w:p>
+    <w:p>
+      <w:pPr>
+        <w:pStyle w:val="Caption"/>
+      </w:pPr>
+      <w:r>
+        <w:t>Figura 9 — Ligando as formas: setas azuis (1), pontos de conexão (2) e a guarda escrita na seta (3).</w:t>
+      </w:r>
+    </w:p>
+    <w:p>
+      <w:pPr/>
+      <w:r>
+        <w:t>Atalhos e cuidados:</w:t>
+      </w:r>
+    </w:p>
+    <w:p>
+      <w:pPr>
+        <w:pStyle w:val="ListBullet"/>
+      </w:pPr>
+      <w:r>
+        <w:t>Duplo clique edita o texto; Ctrl+D duplica a forma selecionada; Ctrl+Z desfaz; Delete apaga.</w:t>
+      </w:r>
+    </w:p>
+    <w:p>
+      <w:pPr>
+        <w:pStyle w:val="ListBullet"/>
+      </w:pPr>
+      <w:r>
+        <w:t>“Start”, “Activity” e “Condition” já vêm com uma seta pendurada: ligue a ponta dela na próxima forma ou apague a seta.</w:t>
+      </w:r>
+    </w:p>
+    <w:p>
+      <w:pPr>
+        <w:pStyle w:val="ListBullet"/>
+      </w:pPr>
+      <w:r>
+        <w:t>Solte cada forma DENTRO da raia certa: a raia fica destacada e, daí em diante, leva a forma junto quando é movida.</w:t>
+      </w:r>
+    </w:p>
+    <w:p>
+      <w:pPr>
+        <w:pStyle w:val="ListBullet"/>
+      </w:pPr>
+      <w:r>
+        <w:t>As formas da paleta UML vêm amarelas com borda vermelha. A cor não muda o significado — pode deixar assim.</w:t>
+      </w:r>
+    </w:p>
+    <w:p>
+      <w:pPr>
+        <w:pStyle w:val="ListBullet"/>
+      </w:pPr>
+      <w:r>
+        <w:t>Quando o fluxo crescer, estique a raia para baixo pelas alças (os quadradinhos azuis).</w:t>
+      </w:r>
+    </w:p>
+    <w:p>
+      <w:pPr>
+        <w:pStyle w:val="ListBullet"/>
+      </w:pPr>
+      <w:r>
+        <w:t>Salve sempre com um nome que identifique o trabalho: Arquivo › Salvar como → “Atividade1_Grupo3.drawio”, por exemplo.</w:t>
+      </w:r>
+    </w:p>
+    <w:p>
+      <w:pPr>
+        <w:pStyle w:val="Heading2"/>
+      </w:pPr>
+      <w:r>
+        <w:t>6.2 Passo a passo do exemplo guiado</w:t>
       </w:r>
     </w:p>
     <w:p>
       <w:r>
-        <w:t>2.  Criem 2 raias (formas “Pool/Lane” ou dois retângulos altos): Cliente e Sistema.</w:t>
+        <w:t>1.  Abram o draw.io e cliquem em “UML” na barra de formas à esquerda (Figura 7).</w:t>
+      </w:r>
+    </w:p>
+    <w:p>
+      <w:r>
+        <w:t>2.  Criem 2 raias com a forma “Vertical Container” da paleta Geral (Figura 8), lado a lado: Cliente e Sistema.</w:t>
       </w:r>
     </w:p>
     <w:p>
@@ -2350,7 +3110,7 @@
       <w:r>
         <w:drawing>
           <wp:inline xmlns:a="http://schemas.openxmlformats.org/drawingml/2006/main" xmlns:pic="http://schemas.openxmlformats.org/drawingml/2006/picture">
-            <wp:extent cx="4749165" cy="5184505"/>
+            <wp:extent cx="4749165" cy="5179611"/>
             <wp:docPr id="6" name="Picture 6"/>
             <wp:cNvGraphicFramePr>
               <a:graphicFrameLocks noChangeAspect="1"/>
@@ -2363,7 +3123,13 @@
                     <pic:cNvPicPr/>
                   </pic:nvPicPr>
                   <pic:blipFill>
-                    <a:blip r:embed="rId14"/>
+                    <a:blip r:embed="rId14">
+                      <a:extLst>
+                        <a:ext uri="{96DAC541-7B7A-43D3-8B79-37D633B846F1}">
+                          <asvg:svgBlip xmlns:asvg="http://schemas.microsoft.com/office/drawing/2016/SVG/main" r:embed="rId21"/>
+                        </a:ext>
+                      </a:extLst>
+                    </a:blip>
                     <a:stretch>
                       <a:fillRect/>
                     </a:stretch>
@@ -2371,7 +3137,7 @@
                   <pic:spPr>
                     <a:xfrm>
                       <a:off x="0" y="0"/>
-                      <a:ext cx="4749165" cy="5184505"/>
+                      <a:ext cx="4749165" cy="5179611"/>
                     </a:xfrm>
                     <a:prstGeom prst="rect"/>
                   </pic:spPr>
@@ -2387,7 +3153,7 @@
         <w:pStyle w:val="Caption"/>
       </w:pPr>
       <w:r>
-        <w:t>Figura 6 — Resultado do exemplo guiado: acumular pontos de fidelidade.</w:t>
+        <w:t>Figura 10 — Resultado do exemplo guiado: acumular pontos de fidelidade.</w:t>
       </w:r>
     </w:p>
     <w:p>
@@ -2416,7 +3182,7 @@
         <w:pStyle w:val="ListBullet"/>
       </w:pPr>
       <w:r>
-        <w:t>A decisão tem as duas saídas com guarda, completas e exclusivas ([≥ 100] / [&lt; 100])?</w:t>
+        <w:t>A decisão tem as duas saídas com guarda, completas e exclusivas ([sim] / [não] na decisão “saldo ≥ 100 pontos?”)?</w:t>
       </w:r>
     </w:p>
     <w:p>
@@ -2950,6 +3716,63 @@
     </w:tbl>
     <w:p/>
     <w:p>
+      <w:pPr/>
+      <w:r>
+        <w:rPr>
+          <w:b/>
+        </w:rPr>
+        <w:t>No draw.io, para esta atividade (tabela da seção 6.1):</w:t>
+      </w:r>
+    </w:p>
+    <w:p>
+      <w:pPr>
+        <w:pStyle w:val="ListBullet"/>
+      </w:pPr>
+      <w:r>
+        <w:t>Raias: três “Vertical Container” (paleta Geral) lado a lado — Cliente, Sistema e Cozinha.</w:t>
+      </w:r>
+    </w:p>
+    <w:p>
+      <w:pPr>
+        <w:pStyle w:val="ListBullet"/>
+      </w:pPr>
+      <w:r>
+        <w:t>Início e fins: “Start” e “End” (paleta UML). O pagamento não confirmado também termina num “End”.</w:t>
+      </w:r>
+    </w:p>
+    <w:p>
+      <w:pPr>
+        <w:pStyle w:val="ListBullet"/>
+      </w:pPr>
+      <w:r>
+        <w:t>Ações: “Activity”. Decisões e a junção do carrinho: “Condition” (o mesmo losango).</w:t>
+      </w:r>
+    </w:p>
+    <w:p>
+      <w:pPr>
+        <w:pStyle w:val="ListBullet"/>
+      </w:pPr>
+      <w:r>
+        <w:t>Preparo e pontos ao mesmo tempo: duas barras “Fork/Join” — uma abre os caminhos, a outra fecha.</w:t>
+      </w:r>
+    </w:p>
+    <w:p>
+      <w:pPr>
+        <w:pStyle w:val="ListBullet"/>
+      </w:pPr>
+      <w:r>
+        <w:t>Laço: puxem a seta de volta até a junção que fica ANTES de “Monta o carrinho”.</w:t>
+      </w:r>
+    </w:p>
+    <w:p>
+      <w:pPr>
+        <w:pStyle w:val="ListBullet"/>
+      </w:pPr>
+      <w:r>
+        <w:t>Guardas: duplo clique em cada seta que sai de um losango e digitem [sim] / [não] (ou a condição).</w:t>
+      </w:r>
+    </w:p>
+    <w:p>
       <w:pPr>
         <w:pStyle w:val="Heading2"/>
       </w:pPr>
@@ -3055,7 +3878,7 @@
     </w:p>
     <w:p>
       <w:r>
-        <w:t>Sozinho(a), desenhe o diagrama de atividades do processo “Reservar vaga em aula coletiva” da Academia FitLife, que você já conhece das Aulas 5 e 6 (Aluno, Aula, Reserva, os atributos derivados /pagamentosEmDia e /vagasDisponiveis). Use 3 raias: Aluno, Sistema e Instrutor. Tempo: 20 minutos; ao terminar, compare com um colega.</w:t>
+        <w:t>Sozinho(a), desenhe o diagrama de atividades do processo “Reservar vaga em aula coletiva” da Academia FitLife, que você já conhece das Aulas 5 e 6 (Aluno, Aula, Reserva, os atributos derivados /pagamentosEmDia e /vagasDisponiveis). Use 3 raias: Aluno, Sistema e Instrutor. Tempo: 15 minutos; ao terminar, compare com um colega.</w:t>
       </w:r>
     </w:p>
     <w:p>
@@ -3091,6 +3914,55 @@
     <w:p>
       <w:r>
         <w:t>6.  Com as duas coisas feitas, o aluno comparece à aula.</w:t>
+      </w:r>
+    </w:p>
+    <w:p>
+      <w:pPr/>
+      <w:r>
+        <w:rPr>
+          <w:b/>
+        </w:rPr>
+        <w:t>No draw.io, para esta atividade (tabela da seção 6.1):</w:t>
+      </w:r>
+    </w:p>
+    <w:p>
+      <w:pPr>
+        <w:pStyle w:val="ListBullet"/>
+      </w:pPr>
+      <w:r>
+        <w:t>Raias: três “Vertical Container” (paleta Geral) lado a lado — Aluno, Sistema e Instrutor.</w:t>
+      </w:r>
+    </w:p>
+    <w:p>
+      <w:pPr>
+        <w:pStyle w:val="ListBullet"/>
+      </w:pPr>
+      <w:r>
+        <w:t>Início: “Start”; ações: “Activity”; as decisões [mensalidade em dia?] e [há vagas?]: “Condition” (paleta UML).</w:t>
+      </w:r>
+    </w:p>
+    <w:p>
+      <w:pPr>
+        <w:pStyle w:val="ListBullet"/>
+      </w:pPr>
+      <w:r>
+        <w:t>Os dois caminhos [não] terminam cada um no seu “End”.</w:t>
+      </w:r>
+    </w:p>
+    <w:p>
+      <w:pPr>
+        <w:pStyle w:val="ListBullet"/>
+      </w:pPr>
+      <w:r>
+        <w:t>Confirmação e lista de presença ao mesmo tempo: duas barras “Fork/Join”.</w:t>
+      </w:r>
+    </w:p>
+    <w:p>
+      <w:pPr>
+        <w:pStyle w:val="ListBullet"/>
+      </w:pPr>
+      <w:r>
+        <w:t>Salve como “Atividade2_SeuNome.drawio”.</w:t>
       </w:r>
     </w:p>
     <w:p>
@@ -3161,7 +4033,7 @@
       <w:r>
         <w:drawing>
           <wp:inline xmlns:a="http://schemas.openxmlformats.org/drawingml/2006/main" xmlns:pic="http://schemas.openxmlformats.org/drawingml/2006/picture">
-            <wp:extent cx="5698998" cy="5005877"/>
+            <wp:extent cx="5663970" cy="5005877"/>
             <wp:docPr id="7" name="Picture 7"/>
             <wp:cNvGraphicFramePr>
               <a:graphicFrameLocks noChangeAspect="1"/>
@@ -3174,7 +4046,13 @@
                     <pic:cNvPicPr/>
                   </pic:nvPicPr>
                   <pic:blipFill>
-                    <a:blip r:embed="rId15"/>
+                    <a:blip r:embed="rId15">
+                      <a:extLst>
+                        <a:ext uri="{96DAC541-7B7A-43D3-8B79-37D633B846F1}">
+                          <asvg:svgBlip xmlns:asvg="http://schemas.microsoft.com/office/drawing/2016/SVG/main" r:embed="rId22"/>
+                        </a:ext>
+                      </a:extLst>
+                    </a:blip>
                     <a:stretch>
                       <a:fillRect/>
                     </a:stretch>
@@ -3182,7 +4060,7 @@
                   <pic:spPr>
                     <a:xfrm>
                       <a:off x="0" y="0"/>
-                      <a:ext cx="5698998" cy="5005877"/>
+                      <a:ext cx="5663970" cy="5005877"/>
                     </a:xfrm>
                     <a:prstGeom prst="rect"/>
                   </pic:spPr>
@@ -3198,7 +4076,7 @@
         <w:pStyle w:val="Caption"/>
       </w:pPr>
       <w:r>
-        <w:t>Figura 7 — Diagrama com 6 erros propositais.</w:t>
+        <w:t>Figura 11 — Diagrama com 6 erros propositais.</w:t>
       </w:r>
     </w:p>
     <w:p>
@@ -4299,6 +5177,47 @@
     </w:tbl>
     <w:p/>
     <w:p>
+      <w:pPr/>
+      <w:r>
+        <w:rPr>
+          <w:b/>
+        </w:rPr>
+        <w:t>No draw.io, para esta atividade (tabela da seção 6.1):</w:t>
+      </w:r>
+    </w:p>
+    <w:p>
+      <w:pPr>
+        <w:pStyle w:val="ListBullet"/>
+      </w:pPr>
+      <w:r>
+        <w:t>As partes A a E podem ser feitas no caderno; a parte F vai no draw.io.</w:t>
+      </w:r>
+    </w:p>
+    <w:p>
+      <w:pPr>
+        <w:pStyle w:val="ListBullet"/>
+      </w:pPr>
+      <w:r>
+        <w:t>Raias: “Vertical Container” (paleta Geral) — Cliente, Sistema e Tosador.</w:t>
+      </w:r>
+    </w:p>
+    <w:p>
+      <w:pPr>
+        <w:pStyle w:val="ListBullet"/>
+      </w:pPr>
+      <w:r>
+        <w:t>Pelo menos 3 decisões com “Condition”, com guarda em TODAS as setas de saída; “Start” e “End” para início e fim.</w:t>
+      </w:r>
+    </w:p>
+    <w:p>
+      <w:pPr>
+        <w:pStyle w:val="ListBullet"/>
+      </w:pPr>
+      <w:r>
+        <w:t>Salvem como “Atividade3_” seguido do nome da dupla, com extensão .drawio.</w:t>
+      </w:r>
+    </w:p>
+    <w:p>
       <w:pPr>
         <w:pStyle w:val="Heading2"/>
       </w:pPr>

</xml_diff>